<commit_message>
Anna brief: rewrite for new approach (master template + 13 draft shells)
</commit_message>
<xml_diff>
--- a/Docs/ANNA_MAILCHIMP_BRIEF.docx
+++ b/Docs/ANNA_MAILCHIMP_BRIEF.docx
@@ -12,7 +12,7 @@
           <w:color w:val="6E3A5A"/>
           <w:sz w:val="44"/>
         </w:rPr>
-        <w:t>Hi Anna — Mailchimp next steps</w:t>
+        <w:t>Hi Anna — Mailchimp is ready for you</w:t>
       </w:r>
     </w:p>
     <w:p>
@@ -24,22 +24,7 @@
           <w:color w:val="231F20"/>
           <w:sz w:val="22"/>
         </w:rPr>
-        <w:t xml:space="preserve">The Stripe + Mailchimp wiring is live on staging. Every signup / purchase / RSVP will automatically tag the right contact in your Mailchimp audience. What's left is for you to build the </w:t>
-      </w:r>
-      <w:r>
-        <w:rPr>
-          <w:b/>
-          <w:color w:val="231F20"/>
-          <w:sz w:val="22"/>
-        </w:rPr>
-        <w:t>welcome email automations</w:t>
-      </w:r>
-      <w:r>
-        <w:rPr>
-          <w:color w:val="231F20"/>
-          <w:sz w:val="22"/>
-        </w:rPr>
-        <w:t xml:space="preserve"> in Mailchimp so those tags actually send emails.</w:t>
+        <w:t>The Stripe + Mailchimp wiring is live on staging. Every signup / purchase / RSVP from the website will automatically tag the right contact in your audience.</w:t>
       </w:r>
     </w:p>
     <w:p>
@@ -52,7 +37,20 @@
           <w:color w:val="6E3A5A"/>
           <w:sz w:val="32"/>
         </w:rPr>
-        <w:t>What's done for you</w:t>
+        <w:t>What I've set up for you</w:t>
+      </w:r>
+    </w:p>
+    <w:p>
+      <w:pPr>
+        <w:spacing w:before="200" w:after="60"/>
+      </w:pPr>
+      <w:r>
+        <w:rPr>
+          <w:b/>
+          <w:color w:val="231F20"/>
+          <w:sz w:val="26"/>
+        </w:rPr>
+        <w:t>1. A master email template — `ALW Master`</w:t>
       </w:r>
     </w:p>
     <w:p>
@@ -64,7 +62,7 @@
           <w:color w:val="231F20"/>
           <w:sz w:val="22"/>
         </w:rPr>
-        <w:t xml:space="preserve">I've already created </w:t>
+        <w:t xml:space="preserve">In Mailchimp → </w:t>
       </w:r>
       <w:r>
         <w:rPr>
@@ -72,223 +70,29 @@
           <w:color w:val="231F20"/>
           <w:sz w:val="22"/>
         </w:rPr>
-        <w:t>13 email templates</w:t>
+        <w:t>Email Templates → Saved templates</w:t>
       </w:r>
       <w:r>
         <w:rPr>
           <w:color w:val="231F20"/>
           <w:sz w:val="22"/>
         </w:rPr>
-        <w:t xml:space="preserve"> in your Mailchimp account, one for each automation. You'll find them in </w:t>
+        <w:t xml:space="preserve"> you'll see </w:t>
       </w:r>
       <w:r>
         <w:rPr>
-          <w:b/>
-          <w:color w:val="231F20"/>
-          <w:sz w:val="22"/>
+          <w:rFonts w:ascii="Consolas" w:hAnsi="Consolas"/>
+          <w:color w:val="6E3A5A"/>
+          <w:sz w:val="20"/>
         </w:rPr>
-        <w:t>Mailchimp → Templates</w:t>
+        <w:t>ALW Master</w:t>
       </w:r>
       <w:r>
         <w:rPr>
           <w:color w:val="231F20"/>
           <w:sz w:val="22"/>
         </w:rPr>
-        <w:t xml:space="preserve"> with names like:</w:t>
-      </w:r>
-    </w:p>
-    <w:p>
-      <w:pPr>
-        <w:pStyle w:val="ListBullet"/>
-        <w:spacing w:after="40"/>
-      </w:pPr>
-      <w:r>
-        <w:rPr>
-          <w:rFonts w:ascii="Consolas" w:hAnsi="Consolas"/>
-          <w:color w:val="6E3A5A"/>
-          <w:sz w:val="20"/>
-        </w:rPr>
-        <w:t>ALW J1A — Reset Letters Founding</w:t>
-      </w:r>
-    </w:p>
-    <w:p>
-      <w:pPr>
-        <w:pStyle w:val="ListBullet"/>
-        <w:spacing w:after="40"/>
-      </w:pPr>
-      <w:r>
-        <w:rPr>
-          <w:rFonts w:ascii="Consolas" w:hAnsi="Consolas"/>
-          <w:color w:val="6E3A5A"/>
-          <w:sz w:val="20"/>
-        </w:rPr>
-        <w:t>ALW J1B — Reset Letters Standard</w:t>
-      </w:r>
-    </w:p>
-    <w:p>
-      <w:pPr>
-        <w:pStyle w:val="ListBullet"/>
-        <w:spacing w:after="40"/>
-      </w:pPr>
-      <w:r>
-        <w:rPr>
-          <w:rFonts w:ascii="Consolas" w:hAnsi="Consolas"/>
-          <w:color w:val="6E3A5A"/>
-          <w:sz w:val="20"/>
-        </w:rPr>
-        <w:t>ALW J2 — Decoder Delivery</w:t>
-      </w:r>
-    </w:p>
-    <w:p>
-      <w:pPr>
-        <w:pStyle w:val="ListBullet"/>
-        <w:spacing w:after="40"/>
-      </w:pPr>
-      <w:r>
-        <w:rPr>
-          <w:rFonts w:ascii="Consolas" w:hAnsi="Consolas"/>
-          <w:color w:val="6E3A5A"/>
-          <w:sz w:val="20"/>
-        </w:rPr>
-        <w:t>ALW J3 — Workshops Confirmation</w:t>
-      </w:r>
-    </w:p>
-    <w:p>
-      <w:pPr>
-        <w:pStyle w:val="ListBullet"/>
-        <w:spacing w:after="40"/>
-      </w:pPr>
-      <w:r>
-        <w:rPr>
-          <w:rFonts w:ascii="Consolas" w:hAnsi="Consolas"/>
-          <w:color w:val="6E3A5A"/>
-          <w:sz w:val="20"/>
-        </w:rPr>
-        <w:t>ALW J4 — Discovery Call Booked</w:t>
-      </w:r>
-    </w:p>
-    <w:p>
-      <w:pPr>
-        <w:pStyle w:val="ListBullet"/>
-        <w:spacing w:after="40"/>
-      </w:pPr>
-      <w:r>
-        <w:rPr>
-          <w:rFonts w:ascii="Consolas" w:hAnsi="Consolas"/>
-          <w:color w:val="6E3A5A"/>
-          <w:sz w:val="20"/>
-        </w:rPr>
-        <w:t>ALW J5 — Returning Circle RSVP</w:t>
-      </w:r>
-    </w:p>
-    <w:p>
-      <w:pPr>
-        <w:pStyle w:val="ListBullet"/>
-        <w:spacing w:after="40"/>
-      </w:pPr>
-      <w:r>
-        <w:rPr>
-          <w:rFonts w:ascii="Consolas" w:hAnsi="Consolas"/>
-          <w:color w:val="6E3A5A"/>
-          <w:sz w:val="20"/>
-        </w:rPr>
-        <w:t>ALW J6 — Reset Room Member</w:t>
-      </w:r>
-    </w:p>
-    <w:p>
-      <w:pPr>
-        <w:pStyle w:val="ListBullet"/>
-        <w:spacing w:after="40"/>
-      </w:pPr>
-      <w:r>
-        <w:rPr>
-          <w:rFonts w:ascii="Consolas" w:hAnsi="Consolas"/>
-          <w:color w:val="6E3A5A"/>
-          <w:sz w:val="20"/>
-        </w:rPr>
-        <w:t>ALW J7 — The Reset (6-week)</w:t>
-      </w:r>
-    </w:p>
-    <w:p>
-      <w:pPr>
-        <w:pStyle w:val="ListBullet"/>
-        <w:spacing w:after="40"/>
-      </w:pPr>
-      <w:r>
-        <w:rPr>
-          <w:rFonts w:ascii="Consolas" w:hAnsi="Consolas"/>
-          <w:color w:val="6E3A5A"/>
-          <w:sz w:val="20"/>
-        </w:rPr>
-        <w:t>ALW J8 — Signal (12-week)</w:t>
-      </w:r>
-    </w:p>
-    <w:p>
-      <w:pPr>
-        <w:pStyle w:val="ListBullet"/>
-        <w:spacing w:after="40"/>
-      </w:pPr>
-      <w:r>
-        <w:rPr>
-          <w:rFonts w:ascii="Consolas" w:hAnsi="Consolas"/>
-          <w:color w:val="6E3A5A"/>
-          <w:sz w:val="20"/>
-        </w:rPr>
-        <w:t>ALW J9 — Signal &amp; Build</w:t>
-      </w:r>
-    </w:p>
-    <w:p>
-      <w:pPr>
-        <w:pStyle w:val="ListBullet"/>
-        <w:spacing w:after="40"/>
-      </w:pPr>
-      <w:r>
-        <w:rPr>
-          <w:rFonts w:ascii="Consolas" w:hAnsi="Consolas"/>
-          <w:color w:val="6E3A5A"/>
-          <w:sz w:val="20"/>
-        </w:rPr>
-        <w:t>ALW J10 — One Day Intensive</w:t>
-      </w:r>
-    </w:p>
-    <w:p>
-      <w:pPr>
-        <w:pStyle w:val="ListBullet"/>
-        <w:spacing w:after="40"/>
-      </w:pPr>
-      <w:r>
-        <w:rPr>
-          <w:rFonts w:ascii="Consolas" w:hAnsi="Consolas"/>
-          <w:color w:val="6E3A5A"/>
-          <w:sz w:val="20"/>
-        </w:rPr>
-        <w:t>ALW J11 — Signal Collective</w:t>
-      </w:r>
-    </w:p>
-    <w:p>
-      <w:pPr>
-        <w:pStyle w:val="ListBullet"/>
-        <w:spacing w:after="40"/>
-      </w:pPr>
-      <w:r>
-        <w:rPr>
-          <w:rFonts w:ascii="Consolas" w:hAnsi="Consolas"/>
-          <w:color w:val="6E3A5A"/>
-          <w:sz w:val="20"/>
-        </w:rPr>
-        <w:t>ALW J12 — Reset Session 90-min</w:t>
-      </w:r>
-    </w:p>
-    <w:p>
-      <w:pPr>
-        <w:spacing w:after="80"/>
-      </w:pPr>
-      <w:r>
-        <w:rPr>
-          <w:color w:val="231F20"/>
-          <w:sz w:val="22"/>
-        </w:rPr>
-        <w:t>Each template has:</w:t>
+        <w:t>. It has:</w:t>
       </w:r>
     </w:p>
     <w:p>
@@ -301,7 +105,7 @@
           <w:color w:val="231F20"/>
           <w:sz w:val="22"/>
         </w:rPr>
-        <w:t>Your branding (header + footer + colours)</w:t>
+        <w:t>The Anna Lou Wellness wordmark at the top</w:t>
       </w:r>
     </w:p>
     <w:p>
@@ -322,7 +126,7 @@
           <w:color w:val="231F20"/>
           <w:sz w:val="22"/>
         </w:rPr>
-        <w:t xml:space="preserve"> greeting</w:t>
+        <w:t xml:space="preserve"> greeting (auto-fills the contact's first name)</w:t>
       </w:r>
     </w:p>
     <w:p>
@@ -335,7 +139,7 @@
           <w:color w:val="231F20"/>
           <w:sz w:val="22"/>
         </w:rPr>
-        <w:t>A placeholder paragraph to replace with your copy</w:t>
+        <w:t>A placeholder paragraph in the middle for you to replace with each email's actual copy</w:t>
       </w:r>
     </w:p>
     <w:p>
@@ -348,7 +152,7 @@
           <w:color w:val="231F20"/>
           <w:sz w:val="22"/>
         </w:rPr>
-        <w:t>Your "Still Sparkling, Anna Lou x" signoff</w:t>
+        <w:t>"Still Sparkling, Anna Lou x" signoff</w:t>
       </w:r>
     </w:p>
     <w:p>
@@ -361,20 +165,7 @@
           <w:color w:val="231F20"/>
           <w:sz w:val="22"/>
         </w:rPr>
-        <w:t>Footer with copyright + unsubscribe</w:t>
-      </w:r>
-    </w:p>
-    <w:p>
-      <w:pPr>
-        <w:spacing w:before="280" w:after="80"/>
-      </w:pPr>
-      <w:r>
-        <w:rPr>
-          <w:b/>
-          <w:color w:val="6E3A5A"/>
-          <w:sz w:val="32"/>
-        </w:rPr>
-        <w:t>Your job — for each of the 13</w:t>
+        <w:t>Branded footer + unsubscribe link</w:t>
       </w:r>
     </w:p>
     <w:p>
@@ -386,168 +177,20 @@
           <w:color w:val="231F20"/>
           <w:sz w:val="22"/>
         </w:rPr>
-        <w:t>In Mailchimp:</w:t>
+        <w:t>You don't need to touch this template. Every journey email already uses it.</w:t>
       </w:r>
     </w:p>
     <w:p>
       <w:pPr>
-        <w:pStyle w:val="ListNumber"/>
-        <w:spacing w:after="40"/>
+        <w:spacing w:before="200" w:after="60"/>
       </w:pPr>
       <w:r>
         <w:rPr>
           <w:b/>
           <w:color w:val="231F20"/>
-          <w:sz w:val="22"/>
+          <w:sz w:val="26"/>
         </w:rPr>
-        <w:t>Mailchimp → Automations → Customer Journeys → Create journey</w:t>
-      </w:r>
-    </w:p>
-    <w:p>
-      <w:pPr>
-        <w:pStyle w:val="ListNumber"/>
-        <w:spacing w:after="40"/>
-      </w:pPr>
-      <w:r>
-        <w:rPr>
-          <w:b/>
-          <w:color w:val="231F20"/>
-          <w:sz w:val="22"/>
-        </w:rPr>
-        <w:t>Starting point:</w:t>
-      </w:r>
-      <w:r>
-        <w:rPr>
-          <w:color w:val="231F20"/>
-          <w:sz w:val="22"/>
-        </w:rPr>
-        <w:t xml:space="preserve"> "When a tag is added"</w:t>
-      </w:r>
-    </w:p>
-    <w:p>
-      <w:pPr>
-        <w:pStyle w:val="ListNumber"/>
-        <w:spacing w:after="40"/>
-      </w:pPr>
-      <w:r>
-        <w:rPr>
-          <w:color w:val="231F20"/>
-          <w:sz w:val="22"/>
-        </w:rPr>
-        <w:t xml:space="preserve">Pick the matching tag (e.g. for J7 use tag </w:t>
-      </w:r>
-      <w:r>
-        <w:rPr>
-          <w:rFonts w:ascii="Consolas" w:hAnsi="Consolas"/>
-          <w:color w:val="6E3A5A"/>
-          <w:sz w:val="20"/>
-        </w:rPr>
-        <w:t>The Reset (6-week)</w:t>
-      </w:r>
-      <w:r>
-        <w:rPr>
-          <w:color w:val="231F20"/>
-          <w:sz w:val="22"/>
-        </w:rPr>
-        <w:t>)</w:t>
-      </w:r>
-    </w:p>
-    <w:p>
-      <w:pPr>
-        <w:pStyle w:val="ListNumber"/>
-        <w:spacing w:after="40"/>
-      </w:pPr>
-      <w:r>
-        <w:rPr>
-          <w:color w:val="231F20"/>
-          <w:sz w:val="22"/>
-        </w:rPr>
-        <w:t xml:space="preserve">Add an </w:t>
-      </w:r>
-      <w:r>
-        <w:rPr>
-          <w:b/>
-          <w:color w:val="231F20"/>
-          <w:sz w:val="22"/>
-        </w:rPr>
-        <w:t>Email</w:t>
-      </w:r>
-      <w:r>
-        <w:rPr>
-          <w:color w:val="231F20"/>
-          <w:sz w:val="22"/>
-        </w:rPr>
-        <w:t xml:space="preserve"> step</w:t>
-      </w:r>
-    </w:p>
-    <w:p>
-      <w:pPr>
-        <w:pStyle w:val="ListNumber"/>
-        <w:spacing w:after="40"/>
-      </w:pPr>
-      <w:r>
-        <w:rPr>
-          <w:b/>
-          <w:color w:val="231F20"/>
-          <w:sz w:val="22"/>
-        </w:rPr>
-        <w:t>Pick a template</w:t>
-      </w:r>
-      <w:r>
-        <w:rPr>
-          <w:color w:val="231F20"/>
-          <w:sz w:val="22"/>
-        </w:rPr>
-        <w:t xml:space="preserve"> → choose </w:t>
-      </w:r>
-      <w:r>
-        <w:rPr>
-          <w:rFonts w:ascii="Consolas" w:hAnsi="Consolas"/>
-          <w:color w:val="6E3A5A"/>
-          <w:sz w:val="20"/>
-        </w:rPr>
-        <w:t>ALW J7 — The Reset (6-week)</w:t>
-      </w:r>
-      <w:r>
-        <w:rPr>
-          <w:color w:val="231F20"/>
-          <w:sz w:val="22"/>
-        </w:rPr>
-        <w:t xml:space="preserve"> (the one matching the journey)</w:t>
-      </w:r>
-    </w:p>
-    <w:p>
-      <w:pPr>
-        <w:pStyle w:val="ListNumber"/>
-        <w:spacing w:after="40"/>
-      </w:pPr>
-      <w:r>
-        <w:rPr>
-          <w:color w:val="231F20"/>
-          <w:sz w:val="22"/>
-        </w:rPr>
-        <w:t>Edit the placeholder paragraph with your actual welcome copy (subjects + preheaders are suggested in the Mailchimp build spec doc I sent earlier)</w:t>
-      </w:r>
-    </w:p>
-    <w:p>
-      <w:pPr>
-        <w:pStyle w:val="ListNumber"/>
-        <w:spacing w:after="40"/>
-      </w:pPr>
-      <w:r>
-        <w:rPr>
-          <w:b/>
-          <w:color w:val="231F20"/>
-          <w:sz w:val="22"/>
-        </w:rPr>
-        <w:t>Turn the journey ON</w:t>
-      </w:r>
-      <w:r>
-        <w:rPr>
-          <w:color w:val="231F20"/>
-          <w:sz w:val="22"/>
-        </w:rPr>
-        <w:t xml:space="preserve"> when you're ready</w:t>
+        <w:t>2. Thirteen Customer Journey drafts</w:t>
       </w:r>
     </w:p>
     <w:p>
@@ -559,120 +202,22 @@
           <w:color w:val="231F20"/>
           <w:sz w:val="22"/>
         </w:rPr>
-        <w:t>That's it. The trigger fires automatically from the website — your only job is the writing.</w:t>
+        <w:t xml:space="preserve">In Mailchimp → </w:t>
       </w:r>
-    </w:p>
-    <w:p>
-      <w:pPr>
-        <w:spacing w:before="280" w:after="80"/>
-      </w:pPr>
-      <w:r>
-        <w:rPr>
-          <w:b/>
-          <w:color w:val="6E3A5A"/>
-          <w:sz w:val="32"/>
-        </w:rPr>
-        <w:t>Priority order</w:t>
-      </w:r>
-    </w:p>
-    <w:p>
-      <w:pPr>
-        <w:spacing w:after="80"/>
-      </w:pPr>
-      <w:r>
-        <w:rPr>
-          <w:color w:val="231F20"/>
-          <w:sz w:val="22"/>
-        </w:rPr>
-        <w:t>Start with these (they fire most often):</w:t>
-      </w:r>
-    </w:p>
-    <w:p>
-      <w:pPr>
-        <w:pStyle w:val="ListNumber"/>
-        <w:spacing w:after="40"/>
-      </w:pPr>
       <w:r>
         <w:rPr>
           <w:b/>
           <w:color w:val="231F20"/>
           <w:sz w:val="22"/>
         </w:rPr>
-        <w:t>J1A — Reset Letters Founding</w:t>
+        <w:t>Automations → Customer Journeys</w:t>
       </w:r>
       <w:r>
         <w:rPr>
           <w:color w:val="231F20"/>
           <w:sz w:val="22"/>
         </w:rPr>
-        <w:t xml:space="preserve"> (already getting signups daily)</w:t>
-      </w:r>
-    </w:p>
-    <w:p>
-      <w:pPr>
-        <w:pStyle w:val="ListNumber"/>
-        <w:spacing w:after="40"/>
-      </w:pPr>
-      <w:r>
-        <w:rPr>
-          <w:b/>
-          <w:color w:val="231F20"/>
-          <w:sz w:val="22"/>
-        </w:rPr>
-        <w:t>J7 — The Reset (6-week)</w:t>
-      </w:r>
-      <w:r>
-        <w:rPr>
-          <w:color w:val="231F20"/>
-          <w:sz w:val="22"/>
-        </w:rPr>
-        <w:t xml:space="preserve"> (highest-value programme)</w:t>
-      </w:r>
-    </w:p>
-    <w:p>
-      <w:pPr>
-        <w:pStyle w:val="ListNumber"/>
-        <w:spacing w:after="40"/>
-      </w:pPr>
-      <w:r>
-        <w:rPr>
-          <w:b/>
-          <w:color w:val="231F20"/>
-          <w:sz w:val="22"/>
-        </w:rPr>
-        <w:t>J6 — Reset Room Member</w:t>
-      </w:r>
-      <w:r>
-        <w:rPr>
-          <w:color w:val="231F20"/>
-          <w:sz w:val="22"/>
-        </w:rPr>
-        <w:t xml:space="preserve"> (subscription welcome)</w:t>
-      </w:r>
-    </w:p>
-    <w:p>
-      <w:pPr>
-        <w:spacing w:after="80"/>
-      </w:pPr>
-      <w:r>
-        <w:rPr>
-          <w:color w:val="231F20"/>
-          <w:sz w:val="22"/>
-        </w:rPr>
-        <w:t>Then work through the rest at your own pace. Until each journey is ON, the tag still goes on the contact but no email goes out.</w:t>
-      </w:r>
-    </w:p>
-    <w:p>
-      <w:pPr>
-        <w:spacing w:before="280" w:after="80"/>
-      </w:pPr>
-      <w:r>
-        <w:rPr>
-          <w:b/>
-          <w:color w:val="6E3A5A"/>
-          <w:sz w:val="32"/>
-        </w:rPr>
-        <w:t>Tag → Journey reference (paste into Mailchimp trigger config)</w:t>
+        <w:t xml:space="preserve"> you'll see 13 drafts:</w:t>
       </w:r>
     </w:p>
     <w:tbl>
@@ -698,7 +243,7 @@
                 <w:color w:val="6E3A5A"/>
                 <w:sz w:val="22"/>
               </w:rPr>
-              <w:t>Journey</w:t>
+              <w:t>Journey name</w:t>
             </w:r>
           </w:p>
         </w:tc>
@@ -714,7 +259,7 @@
                 <w:color w:val="6E3A5A"/>
                 <w:sz w:val="22"/>
               </w:rPr>
-              <w:t>Tag to listen for</w:t>
+              <w:t>Triggered when…</w:t>
             </w:r>
           </w:p>
         </w:tc>
@@ -731,7 +276,7 @@
                 <w:color w:val="231F20"/>
                 <w:sz w:val="22"/>
               </w:rPr>
-              <w:t>J1A</w:t>
+              <w:t>Reset Letters - Founding Welcome</w:t>
             </w:r>
           </w:p>
         </w:tc>
@@ -746,7 +291,7 @@
                 <w:color w:val="231F20"/>
                 <w:sz w:val="22"/>
               </w:rPr>
-              <w:t>Founding Members</w:t>
+              <w:t>Someone signs up as a Founding Member</w:t>
             </w:r>
           </w:p>
         </w:tc>
@@ -763,7 +308,7 @@
                 <w:color w:val="231F20"/>
                 <w:sz w:val="22"/>
               </w:rPr>
-              <w:t>J1B</w:t>
+              <w:t>Reset Letters - Standard Welcome</w:t>
             </w:r>
           </w:p>
         </w:tc>
@@ -778,7 +323,7 @@
                 <w:color w:val="231F20"/>
                 <w:sz w:val="22"/>
               </w:rPr>
-              <w:t>Standard Subscribers</w:t>
+              <w:t>Someone signs up after launch (post 22 June)</w:t>
             </w:r>
           </w:p>
         </w:tc>
@@ -795,7 +340,7 @@
                 <w:color w:val="231F20"/>
                 <w:sz w:val="22"/>
               </w:rPr>
-              <w:t>J2</w:t>
+              <w:t>Decoder - Free Download</w:t>
             </w:r>
           </w:p>
         </w:tc>
@@ -810,7 +355,7 @@
                 <w:color w:val="231F20"/>
                 <w:sz w:val="22"/>
               </w:rPr>
-              <w:t>Decoder Downloaders</w:t>
+              <w:t>Someone downloads the free Nervous System Decoder</w:t>
             </w:r>
           </w:p>
         </w:tc>
@@ -827,7 +372,7 @@
                 <w:color w:val="231F20"/>
                 <w:sz w:val="22"/>
               </w:rPr>
-              <w:t>J3</w:t>
+              <w:t>Workshops - Confirmation</w:t>
             </w:r>
           </w:p>
         </w:tc>
@@ -842,7 +387,7 @@
                 <w:color w:val="231F20"/>
                 <w:sz w:val="22"/>
               </w:rPr>
-              <w:t>Workshop Buyers</w:t>
+              <w:t>Someone buys any workshop</w:t>
             </w:r>
           </w:p>
         </w:tc>
@@ -859,7 +404,7 @@
                 <w:color w:val="231F20"/>
                 <w:sz w:val="22"/>
               </w:rPr>
-              <w:t>J4</w:t>
+              <w:t>Discovery Call - Booked</w:t>
             </w:r>
           </w:p>
         </w:tc>
@@ -874,7 +419,7 @@
                 <w:color w:val="231F20"/>
                 <w:sz w:val="22"/>
               </w:rPr>
-              <w:t>Discovery Call Booked</w:t>
+              <w:t>Someone books a free discovery call</w:t>
             </w:r>
           </w:p>
         </w:tc>
@@ -891,7 +436,7 @@
                 <w:color w:val="231F20"/>
                 <w:sz w:val="22"/>
               </w:rPr>
-              <w:t>J5</w:t>
+              <w:t>Returning Circle - RSVP</w:t>
             </w:r>
           </w:p>
         </w:tc>
@@ -906,7 +451,7 @@
                 <w:color w:val="231F20"/>
                 <w:sz w:val="22"/>
               </w:rPr>
-              <w:t>Returning Circle RSVPs</w:t>
+              <w:t>Someone RSVPs to a weekly Circle</w:t>
             </w:r>
           </w:p>
         </w:tc>
@@ -923,7 +468,7 @@
                 <w:color w:val="231F20"/>
                 <w:sz w:val="22"/>
               </w:rPr>
-              <w:t>J6</w:t>
+              <w:t>Reset Room - Member Onboarding</w:t>
             </w:r>
           </w:p>
         </w:tc>
@@ -938,7 +483,7 @@
                 <w:color w:val="231F20"/>
                 <w:sz w:val="22"/>
               </w:rPr>
-              <w:t>Reset Room Members</w:t>
+              <w:t>Someone subscribes (£25/month)</w:t>
             </w:r>
           </w:p>
         </w:tc>
@@ -955,7 +500,7 @@
                 <w:color w:val="231F20"/>
                 <w:sz w:val="22"/>
               </w:rPr>
-              <w:t>J7</w:t>
+              <w:t>The Reset - Programme Onboarding</w:t>
             </w:r>
           </w:p>
         </w:tc>
@@ -970,7 +515,7 @@
                 <w:color w:val="231F20"/>
                 <w:sz w:val="22"/>
               </w:rPr>
-              <w:t>The Reset (6-week)</w:t>
+              <w:t>Someone books The Reset (6-week)</w:t>
             </w:r>
           </w:p>
         </w:tc>
@@ -987,7 +532,7 @@
                 <w:color w:val="231F20"/>
                 <w:sz w:val="22"/>
               </w:rPr>
-              <w:t>J8</w:t>
+              <w:t>Signal - Programme Onboarding</w:t>
             </w:r>
           </w:p>
         </w:tc>
@@ -1002,7 +547,7 @@
                 <w:color w:val="231F20"/>
                 <w:sz w:val="22"/>
               </w:rPr>
-              <w:t>Signal (12-week)</w:t>
+              <w:t>Someone books Signal (12-week)</w:t>
             </w:r>
           </w:p>
         </w:tc>
@@ -1019,7 +564,7 @@
                 <w:color w:val="231F20"/>
                 <w:sz w:val="22"/>
               </w:rPr>
-              <w:t>J9</w:t>
+              <w:t>Signal &amp; Build - Founder Onboarding</w:t>
             </w:r>
           </w:p>
         </w:tc>
@@ -1034,7 +579,7 @@
                 <w:color w:val="231F20"/>
                 <w:sz w:val="22"/>
               </w:rPr>
-              <w:t>Signal &amp; Build (founders)</w:t>
+              <w:t>Someone books Signal &amp; Build</w:t>
             </w:r>
           </w:p>
         </w:tc>
@@ -1051,7 +596,7 @@
                 <w:color w:val="231F20"/>
                 <w:sz w:val="22"/>
               </w:rPr>
-              <w:t>J10</w:t>
+              <w:t>One Day - Intensive Onboarding</w:t>
             </w:r>
           </w:p>
         </w:tc>
@@ -1066,7 +611,7 @@
                 <w:color w:val="231F20"/>
                 <w:sz w:val="22"/>
               </w:rPr>
-              <w:t>One Day Intensive</w:t>
+              <w:t>Someone books a One Day Intensive</w:t>
             </w:r>
           </w:p>
         </w:tc>
@@ -1083,7 +628,7 @@
                 <w:color w:val="231F20"/>
                 <w:sz w:val="22"/>
               </w:rPr>
-              <w:t>J11</w:t>
+              <w:t>Signal Collective - Mastermind</w:t>
             </w:r>
           </w:p>
         </w:tc>
@@ -1098,7 +643,7 @@
                 <w:color w:val="231F20"/>
                 <w:sz w:val="22"/>
               </w:rPr>
-              <w:t>Signal Collective</w:t>
+              <w:t>Someone joins the Collective</w:t>
             </w:r>
           </w:p>
         </w:tc>
@@ -1115,7 +660,7 @@
                 <w:color w:val="231F20"/>
                 <w:sz w:val="22"/>
               </w:rPr>
-              <w:t>J12</w:t>
+              <w:t>Reset Session - 90min Booking</w:t>
             </w:r>
           </w:p>
         </w:tc>
@@ -1130,7 +675,7 @@
                 <w:color w:val="231F20"/>
                 <w:sz w:val="22"/>
               </w:rPr>
-              <w:t>Reset Session (90-min)</w:t>
+              <w:t>Someone books a 90-min session</w:t>
             </w:r>
           </w:p>
         </w:tc>
@@ -1146,7 +691,46 @@
           <w:color w:val="231F20"/>
           <w:sz w:val="22"/>
         </w:rPr>
-        <w:t>If you create a tag with a different name than what's listed here, just let Sameer know and he'll update the code.</w:t>
+        <w:t>Each one already has:</w:t>
+      </w:r>
+    </w:p>
+    <w:p>
+      <w:pPr>
+        <w:pStyle w:val="ListBullet"/>
+        <w:spacing w:after="40"/>
+      </w:pPr>
+      <w:r>
+        <w:rPr>
+          <w:color w:val="231F20"/>
+          <w:sz w:val="22"/>
+        </w:rPr>
+        <w:t>The trigger wired (the right tag)</w:t>
+      </w:r>
+    </w:p>
+    <w:p>
+      <w:pPr>
+        <w:pStyle w:val="ListBullet"/>
+        <w:spacing w:after="40"/>
+      </w:pPr>
+      <w:r>
+        <w:rPr>
+          <w:color w:val="231F20"/>
+          <w:sz w:val="22"/>
+        </w:rPr>
+        <w:t>The subject line and preview text set</w:t>
+      </w:r>
+    </w:p>
+    <w:p>
+      <w:pPr>
+        <w:pStyle w:val="ListBullet"/>
+        <w:spacing w:after="40"/>
+      </w:pPr>
+      <w:r>
+        <w:rPr>
+          <w:color w:val="231F20"/>
+          <w:sz w:val="22"/>
+        </w:rPr>
+        <w:t>The ALW Master template attached</w:t>
       </w:r>
     </w:p>
     <w:p>
@@ -1159,7 +743,7 @@
           <w:color w:val="6E3A5A"/>
           <w:sz w:val="32"/>
         </w:rPr>
-        <w:t>Anything missing?</w:t>
+        <w:t>Your job</w:t>
       </w:r>
     </w:p>
     <w:p>
@@ -1171,7 +755,493 @@
           <w:color w:val="231F20"/>
           <w:sz w:val="22"/>
         </w:rPr>
-        <w:t>If you want a journey for something not on this list (e.g. abandoned cart, post-workshop follow-up, birthday email) — just message and we'll wire it.</w:t>
+        <w:t>For each of the 13 journeys:</w:t>
+      </w:r>
+    </w:p>
+    <w:p>
+      <w:pPr>
+        <w:pStyle w:val="ListNumber"/>
+        <w:spacing w:after="40"/>
+      </w:pPr>
+      <w:r>
+        <w:rPr>
+          <w:color w:val="231F20"/>
+          <w:sz w:val="22"/>
+        </w:rPr>
+        <w:t>Click the journey in the list</w:t>
+      </w:r>
+    </w:p>
+    <w:p>
+      <w:pPr>
+        <w:pStyle w:val="ListNumber"/>
+        <w:spacing w:after="40"/>
+      </w:pPr>
+      <w:r>
+        <w:rPr>
+          <w:color w:val="231F20"/>
+          <w:sz w:val="22"/>
+        </w:rPr>
+        <w:t xml:space="preserve">Click on the </w:t>
+      </w:r>
+      <w:r>
+        <w:rPr>
+          <w:b/>
+          <w:color w:val="231F20"/>
+          <w:sz w:val="22"/>
+        </w:rPr>
+        <w:t>Send email</w:t>
+      </w:r>
+      <w:r>
+        <w:rPr>
+          <w:color w:val="231F20"/>
+          <w:sz w:val="22"/>
+        </w:rPr>
+        <w:t xml:space="preserve"> step</w:t>
+      </w:r>
+    </w:p>
+    <w:p>
+      <w:pPr>
+        <w:pStyle w:val="ListNumber"/>
+        <w:spacing w:after="40"/>
+      </w:pPr>
+      <w:r>
+        <w:rPr>
+          <w:color w:val="231F20"/>
+          <w:sz w:val="22"/>
+        </w:rPr>
+        <w:t xml:space="preserve">Click </w:t>
+      </w:r>
+      <w:r>
+        <w:rPr>
+          <w:b/>
+          <w:color w:val="231F20"/>
+          <w:sz w:val="22"/>
+        </w:rPr>
+        <w:t>Edit Email Content</w:t>
+      </w:r>
+      <w:r>
+        <w:rPr>
+          <w:color w:val="231F20"/>
+          <w:sz w:val="22"/>
+        </w:rPr>
+        <w:t xml:space="preserve"> (or </w:t>
+      </w:r>
+      <w:r>
+        <w:rPr>
+          <w:b/>
+          <w:color w:val="231F20"/>
+          <w:sz w:val="22"/>
+        </w:rPr>
+        <w:t>Design Email</w:t>
+      </w:r>
+      <w:r>
+        <w:rPr>
+          <w:color w:val="231F20"/>
+          <w:sz w:val="22"/>
+        </w:rPr>
+        <w:t>)</w:t>
+      </w:r>
+    </w:p>
+    <w:p>
+      <w:pPr>
+        <w:pStyle w:val="ListNumber"/>
+        <w:spacing w:after="40"/>
+      </w:pPr>
+      <w:r>
+        <w:rPr>
+          <w:color w:val="231F20"/>
+          <w:sz w:val="22"/>
+        </w:rPr>
+        <w:t>The ALW Master template loads with brand header/footer already there</w:t>
+      </w:r>
+    </w:p>
+    <w:p>
+      <w:pPr>
+        <w:pStyle w:val="ListNumber"/>
+        <w:spacing w:after="40"/>
+      </w:pPr>
+      <w:r>
+        <w:rPr>
+          <w:b/>
+          <w:color w:val="231F20"/>
+          <w:sz w:val="22"/>
+        </w:rPr>
+        <w:t>Replace the middle placeholder paragraph</w:t>
+      </w:r>
+      <w:r>
+        <w:rPr>
+          <w:color w:val="231F20"/>
+          <w:sz w:val="22"/>
+        </w:rPr>
+        <w:t xml:space="preserve"> with the actual welcome copy you want to send</w:t>
+      </w:r>
+    </w:p>
+    <w:p>
+      <w:pPr>
+        <w:pStyle w:val="ListNumber"/>
+        <w:spacing w:after="40"/>
+      </w:pPr>
+      <w:r>
+        <w:rPr>
+          <w:color w:val="231F20"/>
+          <w:sz w:val="22"/>
+        </w:rPr>
+        <w:t>Save the email</w:t>
+      </w:r>
+    </w:p>
+    <w:p>
+      <w:pPr>
+        <w:pStyle w:val="ListNumber"/>
+        <w:spacing w:after="40"/>
+      </w:pPr>
+      <w:r>
+        <w:rPr>
+          <w:color w:val="231F20"/>
+          <w:sz w:val="22"/>
+        </w:rPr>
+        <w:t xml:space="preserve">Back on the canvas, click </w:t>
+      </w:r>
+      <w:r>
+        <w:rPr>
+          <w:b/>
+          <w:color w:val="231F20"/>
+          <w:sz w:val="22"/>
+        </w:rPr>
+        <w:t>Continue</w:t>
+      </w:r>
+      <w:r>
+        <w:rPr>
+          <w:color w:val="231F20"/>
+          <w:sz w:val="22"/>
+        </w:rPr>
+        <w:t xml:space="preserve"> at the top → </w:t>
+      </w:r>
+      <w:r>
+        <w:rPr>
+          <w:b/>
+          <w:color w:val="231F20"/>
+          <w:sz w:val="22"/>
+        </w:rPr>
+        <w:t>Turn flow on</w:t>
+      </w:r>
+      <w:r>
+        <w:rPr>
+          <w:color w:val="231F20"/>
+          <w:sz w:val="22"/>
+        </w:rPr>
+        <w:t xml:space="preserve"> (when you're ready to go live)</w:t>
+      </w:r>
+    </w:p>
+    <w:p>
+      <w:pPr>
+        <w:spacing w:after="80"/>
+      </w:pPr>
+      <w:r>
+        <w:rPr>
+          <w:color w:val="231F20"/>
+          <w:sz w:val="22"/>
+        </w:rPr>
+        <w:t>The journey starts firing as soon as you turn it on. Until then it stays paused.</w:t>
+      </w:r>
+    </w:p>
+    <w:p>
+      <w:pPr>
+        <w:spacing w:before="280" w:after="80"/>
+      </w:pPr>
+      <w:r>
+        <w:rPr>
+          <w:b/>
+          <w:color w:val="6E3A5A"/>
+          <w:sz w:val="32"/>
+        </w:rPr>
+        <w:t>Priority order</w:t>
+      </w:r>
+    </w:p>
+    <w:p>
+      <w:pPr>
+        <w:spacing w:after="80"/>
+      </w:pPr>
+      <w:r>
+        <w:rPr>
+          <w:color w:val="231F20"/>
+          <w:sz w:val="22"/>
+        </w:rPr>
+        <w:t>Start with these — they fire most often:</w:t>
+      </w:r>
+    </w:p>
+    <w:p>
+      <w:pPr>
+        <w:pStyle w:val="ListNumber"/>
+        <w:spacing w:after="40"/>
+      </w:pPr>
+      <w:r>
+        <w:rPr>
+          <w:b/>
+          <w:color w:val="231F20"/>
+          <w:sz w:val="22"/>
+        </w:rPr>
+        <w:t>Reset Letters - Founding Welcome</w:t>
+      </w:r>
+      <w:r>
+        <w:rPr>
+          <w:color w:val="231F20"/>
+          <w:sz w:val="22"/>
+        </w:rPr>
+        <w:t xml:space="preserve"> (daily signups happening already)</w:t>
+      </w:r>
+    </w:p>
+    <w:p>
+      <w:pPr>
+        <w:pStyle w:val="ListNumber"/>
+        <w:spacing w:after="40"/>
+      </w:pPr>
+      <w:r>
+        <w:rPr>
+          <w:b/>
+          <w:color w:val="231F20"/>
+          <w:sz w:val="22"/>
+        </w:rPr>
+        <w:t>Reset Room - Member Onboarding</w:t>
+      </w:r>
+      <w:r>
+        <w:rPr>
+          <w:color w:val="231F20"/>
+          <w:sz w:val="22"/>
+        </w:rPr>
+        <w:t xml:space="preserve"> (subscription welcome)</w:t>
+      </w:r>
+    </w:p>
+    <w:p>
+      <w:pPr>
+        <w:pStyle w:val="ListNumber"/>
+        <w:spacing w:after="40"/>
+      </w:pPr>
+      <w:r>
+        <w:rPr>
+          <w:b/>
+          <w:color w:val="231F20"/>
+          <w:sz w:val="22"/>
+        </w:rPr>
+        <w:t>The Reset - Programme Onboarding</w:t>
+      </w:r>
+      <w:r>
+        <w:rPr>
+          <w:color w:val="231F20"/>
+          <w:sz w:val="22"/>
+        </w:rPr>
+        <w:t xml:space="preserve"> (highest-value programme)</w:t>
+      </w:r>
+    </w:p>
+    <w:p>
+      <w:pPr>
+        <w:spacing w:after="80"/>
+      </w:pPr>
+      <w:r>
+        <w:rPr>
+          <w:color w:val="231F20"/>
+          <w:sz w:val="22"/>
+        </w:rPr>
+        <w:t>Then work through the rest at your own pace. Until each is turned ON, the tag still gets applied to the contact but no email goes out.</w:t>
+      </w:r>
+    </w:p>
+    <w:p>
+      <w:pPr>
+        <w:spacing w:before="280" w:after="80"/>
+      </w:pPr>
+      <w:r>
+        <w:rPr>
+          <w:b/>
+          <w:color w:val="6E3A5A"/>
+          <w:sz w:val="32"/>
+        </w:rPr>
+        <w:t>A few notes</w:t>
+      </w:r>
+    </w:p>
+    <w:p>
+      <w:pPr>
+        <w:pStyle w:val="ListBullet"/>
+        <w:spacing w:after="40"/>
+      </w:pPr>
+      <w:r>
+        <w:rPr>
+          <w:b/>
+          <w:color w:val="231F20"/>
+          <w:sz w:val="22"/>
+        </w:rPr>
+        <w:t>Dynamic content</w:t>
+      </w:r>
+      <w:r>
+        <w:rPr>
+          <w:color w:val="231F20"/>
+          <w:sz w:val="22"/>
+        </w:rPr>
+        <w:t xml:space="preserve"> (like workshop dates or Zoom links): we haven't wired this yet. Right now your emails will go to everyone with the same body. If you need any line to vary per recipient (workshop date, programme start date, session Zoom link), tell Sameer which fields and he'll add them as merge tags.</w:t>
+      </w:r>
+    </w:p>
+    <w:p>
+      <w:pPr>
+        <w:pStyle w:val="ListBullet"/>
+        <w:spacing w:after="40"/>
+      </w:pPr>
+      <w:r>
+        <w:rPr>
+          <w:b/>
+          <w:color w:val="231F20"/>
+          <w:sz w:val="22"/>
+        </w:rPr>
+        <w:t>From name</w:t>
+      </w:r>
+      <w:r>
+        <w:rPr>
+          <w:color w:val="231F20"/>
+          <w:sz w:val="22"/>
+        </w:rPr>
+        <w:t xml:space="preserve"> is currently </w:t>
+      </w:r>
+      <w:r>
+        <w:rPr>
+          <w:rFonts w:ascii="Consolas" w:hAnsi="Consolas"/>
+          <w:color w:val="6E3A5A"/>
+          <w:sz w:val="20"/>
+        </w:rPr>
+        <w:t>AnnaLouWellness</w:t>
+      </w:r>
+      <w:r>
+        <w:rPr>
+          <w:color w:val="231F20"/>
+          <w:sz w:val="22"/>
+        </w:rPr>
+        <w:t xml:space="preserve"> (your audience name). You can change it to just </w:t>
+      </w:r>
+      <w:r>
+        <w:rPr>
+          <w:rFonts w:ascii="Consolas" w:hAnsi="Consolas"/>
+          <w:color w:val="6E3A5A"/>
+          <w:sz w:val="20"/>
+        </w:rPr>
+        <w:t>Anna Lou</w:t>
+      </w:r>
+      <w:r>
+        <w:rPr>
+          <w:color w:val="231F20"/>
+          <w:sz w:val="22"/>
+        </w:rPr>
+        <w:t xml:space="preserve"> in each email's "To &amp; From" section if you prefer.</w:t>
+      </w:r>
+    </w:p>
+    <w:p>
+      <w:pPr>
+        <w:pStyle w:val="ListBullet"/>
+        <w:spacing w:after="40"/>
+      </w:pPr>
+      <w:r>
+        <w:rPr>
+          <w:b/>
+          <w:color w:val="231F20"/>
+          <w:sz w:val="22"/>
+        </w:rPr>
+        <w:t>Default Mailchimp From email</w:t>
+      </w:r>
+      <w:r>
+        <w:rPr>
+          <w:color w:val="231F20"/>
+          <w:sz w:val="22"/>
+        </w:rPr>
+        <w:t xml:space="preserve"> is </w:t>
+      </w:r>
+      <w:r>
+        <w:rPr>
+          <w:rFonts w:ascii="Consolas" w:hAnsi="Consolas"/>
+          <w:color w:val="6E3A5A"/>
+          <w:sz w:val="20"/>
+        </w:rPr>
+        <w:t>anna@annalouoflondon.com</w:t>
+      </w:r>
+      <w:r>
+        <w:rPr>
+          <w:color w:val="231F20"/>
+          <w:sz w:val="22"/>
+        </w:rPr>
+        <w:t xml:space="preserve">. If you'd rather these come from </w:t>
+      </w:r>
+      <w:r>
+        <w:rPr>
+          <w:rFonts w:ascii="Consolas" w:hAnsi="Consolas"/>
+          <w:color w:val="6E3A5A"/>
+          <w:sz w:val="20"/>
+        </w:rPr>
+        <w:t>hello@annalouwellness.com</w:t>
+      </w:r>
+      <w:r>
+        <w:rPr>
+          <w:color w:val="231F20"/>
+          <w:sz w:val="22"/>
+        </w:rPr>
+        <w:t>, update it in Mailchimp → Audience → Settings → Defaults.</w:t>
+      </w:r>
+    </w:p>
+    <w:p>
+      <w:pPr>
+        <w:spacing w:before="280" w:after="80"/>
+      </w:pPr>
+      <w:r>
+        <w:rPr>
+          <w:b/>
+          <w:color w:val="6E3A5A"/>
+          <w:sz w:val="32"/>
+        </w:rPr>
+        <w:t>If something doesn't fire</w:t>
+      </w:r>
+    </w:p>
+    <w:p>
+      <w:pPr>
+        <w:spacing w:after="80"/>
+      </w:pPr>
+      <w:r>
+        <w:rPr>
+          <w:color w:val="231F20"/>
+          <w:sz w:val="22"/>
+        </w:rPr>
+        <w:t>If you turn a journey ON and emails aren't sending:</w:t>
+      </w:r>
+    </w:p>
+    <w:p>
+      <w:pPr>
+        <w:pStyle w:val="ListBullet"/>
+        <w:spacing w:after="40"/>
+      </w:pPr>
+      <w:r>
+        <w:rPr>
+          <w:color w:val="231F20"/>
+          <w:sz w:val="22"/>
+        </w:rPr>
+        <w:t>Check the journey status is "Active" (not Draft or Paused)</w:t>
+      </w:r>
+    </w:p>
+    <w:p>
+      <w:pPr>
+        <w:pStyle w:val="ListBullet"/>
+        <w:spacing w:after="40"/>
+      </w:pPr>
+      <w:r>
+        <w:rPr>
+          <w:color w:val="231F20"/>
+          <w:sz w:val="22"/>
+        </w:rPr>
+        <w:t>Confirm the trigger tag exists in your audience (Audience → Tags)</w:t>
+      </w:r>
+    </w:p>
+    <w:p>
+      <w:pPr>
+        <w:pStyle w:val="ListBullet"/>
+        <w:spacing w:after="40"/>
+      </w:pPr>
+      <w:r>
+        <w:rPr>
+          <w:color w:val="231F20"/>
+          <w:sz w:val="22"/>
+        </w:rPr>
+        <w:t>Send Sameer a screenshot — most issues are 5-min fixes</w:t>
       </w:r>
     </w:p>
     <w:sectPr>

</xml_diff>